<commit_message>
V15 Final: Updated figures (EPS+PNG), supporting docs (S1-S9), README with corrected Macro-F1 (0.402/0.635), removed stale files
</commit_message>
<xml_diff>
--- a/Supplementary_Information/S2_Table_TRIPOD_AI_Checklist.docx
+++ b/Supplementary_Information/S2_Table_TRIPOD_AI_Checklist.docx
@@ -4,15 +4,20 @@
   <w:body>
     <w:p>
       <w:pPr>
-        <w:jc w:val="center"/>
+        <w:pStyle w:val="Heading1"/>
       </w:pPr>
       <w:r>
-        <w:rPr>
-          <w:rFonts w:ascii="Times New Roman" w:hAnsi="Times New Roman"/>
-          <w:b/>
-          <w:sz w:val="24"/>
-        </w:rPr>
-        <w:t>S2 Table. TRIPOD+AI Checklist for Prediction Model Development and Validation</w:t>
+        <w:t>S2 Table. TRIPOD+AI Checklist</w:t>
+      </w:r>
+    </w:p>
+    <w:p>
+      <w:r>
+        <w:t>Transparent Reporting of a Multivariable Prediction Model for Individual Prognosis or Diagnosis — Artificial Intelligence Extension</w:t>
+      </w:r>
+    </w:p>
+    <w:p>
+      <w:r>
+        <w:t>Checklist completed against PONE_Condensed_V12 manuscript.</w:t>
       </w:r>
     </w:p>
     <w:p/>
@@ -20,7 +25,6 @@
       <w:tblPr>
         <w:tblStyle w:val="TableGrid"/>
         <w:tblW w:type="auto" w:w="0"/>
-        <w:jc w:val="center"/>
         <w:tblLook w:firstColumn="1" w:firstRow="1" w:lastColumn="0" w:lastRow="0" w:noHBand="0" w:noVBand="1" w:val="04A0"/>
       </w:tblPr>
       <w:tblGrid>
@@ -35,13 +39,7 @@
             <w:tcW w:type="dxa" w:w="2160"/>
           </w:tcPr>
           <w:p>
-            <w:r/>
             <w:r>
-              <w:rPr>
-                <w:rFonts w:ascii="Times New Roman" w:hAnsi="Times New Roman"/>
-                <w:b/>
-                <w:sz w:val="18"/>
-              </w:rPr>
               <w:t>Section/Topic</w:t>
             </w:r>
           </w:p>
@@ -51,14 +49,8 @@
             <w:tcW w:type="dxa" w:w="2160"/>
           </w:tcPr>
           <w:p>
-            <w:r/>
             <w:r>
-              <w:rPr>
-                <w:rFonts w:ascii="Times New Roman" w:hAnsi="Times New Roman"/>
-                <w:b/>
-                <w:sz w:val="18"/>
-              </w:rPr>
-              <w:t>Item No.</w:t>
+              <w:t>Item</w:t>
             </w:r>
           </w:p>
         </w:tc>
@@ -67,13 +59,7 @@
             <w:tcW w:type="dxa" w:w="2160"/>
           </w:tcPr>
           <w:p>
-            <w:r/>
             <w:r>
-              <w:rPr>
-                <w:rFonts w:ascii="Times New Roman" w:hAnsi="Times New Roman"/>
-                <w:b/>
-                <w:sz w:val="18"/>
-              </w:rPr>
               <w:t>Checklist Item</w:t>
             </w:r>
           </w:p>
@@ -83,14 +69,8 @@
             <w:tcW w:type="dxa" w:w="2160"/>
           </w:tcPr>
           <w:p>
-            <w:r/>
             <w:r>
-              <w:rPr>
-                <w:rFonts w:ascii="Times New Roman" w:hAnsi="Times New Roman"/>
-                <w:b/>
-                <w:sz w:val="18"/>
-              </w:rPr>
-              <w:t>Reported on Page/Section</w:t>
+              <w:t>Location in V12</w:t>
             </w:r>
           </w:p>
         </w:tc>
@@ -101,13 +81,7 @@
             <w:tcW w:type="dxa" w:w="2160"/>
           </w:tcPr>
           <w:p>
-            <w:r/>
             <w:r>
-              <w:rPr>
-                <w:rFonts w:ascii="Times New Roman" w:hAnsi="Times New Roman"/>
-                <w:b w:val="0"/>
-                <w:sz w:val="18"/>
-              </w:rPr>
               <w:t>Title</w:t>
             </w:r>
           </w:p>
@@ -117,13 +91,7 @@
             <w:tcW w:type="dxa" w:w="2160"/>
           </w:tcPr>
           <w:p>
-            <w:r/>
             <w:r>
-              <w:rPr>
-                <w:rFonts w:ascii="Times New Roman" w:hAnsi="Times New Roman"/>
-                <w:b w:val="0"/>
-                <w:sz w:val="18"/>
-              </w:rPr>
               <w:t>1</w:t>
             </w:r>
           </w:p>
@@ -133,14 +101,8 @@
             <w:tcW w:type="dxa" w:w="2160"/>
           </w:tcPr>
           <w:p>
-            <w:r/>
             <w:r>
-              <w:rPr>
-                <w:rFonts w:ascii="Times New Roman" w:hAnsi="Times New Roman"/>
-                <w:b w:val="0"/>
-                <w:sz w:val="18"/>
-              </w:rPr>
-              <w:t>Identify the study as developing and/or validating a multivariable prediction model, the target population, and the outcome to be predicted</w:t>
+              <w:t>Identify the study as developing/validating a prediction model</w:t>
             </w:r>
           </w:p>
         </w:tc>
@@ -150,7 +112,7 @@
           </w:tcPr>
           <w:p>
             <w:r>
-              <w:t>Title</w:t>
+              <w:t>Title and Abstract (Background)</w:t>
             </w:r>
           </w:p>
         </w:tc>
@@ -161,13 +123,7 @@
             <w:tcW w:type="dxa" w:w="2160"/>
           </w:tcPr>
           <w:p>
-            <w:r/>
             <w:r>
-              <w:rPr>
-                <w:rFonts w:ascii="Times New Roman" w:hAnsi="Times New Roman"/>
-                <w:b w:val="0"/>
-                <w:sz w:val="18"/>
-              </w:rPr>
               <w:t>Abstract</w:t>
             </w:r>
           </w:p>
@@ -177,13 +133,7 @@
             <w:tcW w:type="dxa" w:w="2160"/>
           </w:tcPr>
           <w:p>
-            <w:r/>
             <w:r>
-              <w:rPr>
-                <w:rFonts w:ascii="Times New Roman" w:hAnsi="Times New Roman"/>
-                <w:b w:val="0"/>
-                <w:sz w:val="18"/>
-              </w:rPr>
               <w:t>2</w:t>
             </w:r>
           </w:p>
@@ -193,14 +143,8 @@
             <w:tcW w:type="dxa" w:w="2160"/>
           </w:tcPr>
           <w:p>
-            <w:r/>
             <w:r>
-              <w:rPr>
-                <w:rFonts w:ascii="Times New Roman" w:hAnsi="Times New Roman"/>
-                <w:b w:val="0"/>
-                <w:sz w:val="18"/>
-              </w:rPr>
-              <w:t>Provide a summary of objectives, study design, setting, participants, sample size, predictors, outcome, statistical analysis, results, and conclusions</w:t>
+              <w:t>Provide structured summary of objectives, methods, results, conclusions</w:t>
             </w:r>
           </w:p>
         </w:tc>
@@ -210,7 +154,7 @@
           </w:tcPr>
           <w:p>
             <w:r>
-              <w:t>Abstract</w:t>
+              <w:t>Abstract: Background, Methods, Results, Conclusion subsections</w:t>
             </w:r>
           </w:p>
         </w:tc>
@@ -221,13 +165,7 @@
             <w:tcW w:type="dxa" w:w="2160"/>
           </w:tcPr>
           <w:p>
-            <w:r/>
             <w:r>
-              <w:rPr>
-                <w:rFonts w:ascii="Times New Roman" w:hAnsi="Times New Roman"/>
-                <w:b/>
-                <w:sz w:val="18"/>
-              </w:rPr>
               <w:t>Introduction</w:t>
             </w:r>
           </w:p>
@@ -237,13 +175,8 @@
             <w:tcW w:type="dxa" w:w="2160"/>
           </w:tcPr>
           <w:p>
-            <w:r/>
             <w:r>
-              <w:rPr>
-                <w:rFonts w:ascii="Times New Roman" w:hAnsi="Times New Roman"/>
-                <w:b w:val="0"/>
-                <w:sz w:val="18"/>
-              </w:rPr>
+              <w:t>3a</w:t>
             </w:r>
           </w:p>
         </w:tc>
@@ -252,13 +185,8 @@
             <w:tcW w:type="dxa" w:w="2160"/>
           </w:tcPr>
           <w:p>
-            <w:r/>
             <w:r>
-              <w:rPr>
-                <w:rFonts w:ascii="Times New Roman" w:hAnsi="Times New Roman"/>
-                <w:b w:val="0"/>
-                <w:sz w:val="18"/>
-              </w:rPr>
+              <w:t>Explain the clinical context and rationale</w:t>
             </w:r>
           </w:p>
         </w:tc>
@@ -267,13 +195,8 @@
             <w:tcW w:type="dxa" w:w="2160"/>
           </w:tcPr>
           <w:p>
-            <w:r/>
             <w:r>
-              <w:rPr>
-                <w:rFonts w:ascii="Times New Roman" w:hAnsi="Times New Roman"/>
-                <w:b w:val="0"/>
-                <w:sz w:val="18"/>
-              </w:rPr>
+              <w:t>Introduction, paragraphs 1-3</w:t>
             </w:r>
           </w:p>
         </w:tc>
@@ -284,46 +207,8 @@
             <w:tcW w:type="dxa" w:w="2160"/>
           </w:tcPr>
           <w:p>
-            <w:r/>
             <w:r>
-              <w:rPr>
-                <w:rFonts w:ascii="Times New Roman" w:hAnsi="Times New Roman"/>
-                <w:b w:val="0"/>
-                <w:sz w:val="18"/>
-              </w:rPr>
-              <w:t>Background and objectives</w:t>
-            </w:r>
-          </w:p>
-        </w:tc>
-        <w:tc>
-          <w:tcPr>
-            <w:tcW w:type="dxa" w:w="2160"/>
-          </w:tcPr>
-          <w:p>
-            <w:r/>
-            <w:r>
-              <w:rPr>
-                <w:rFonts w:ascii="Times New Roman" w:hAnsi="Times New Roman"/>
-                <w:b w:val="0"/>
-                <w:sz w:val="18"/>
-              </w:rPr>
-              <w:t>3a</w:t>
-            </w:r>
-          </w:p>
-        </w:tc>
-        <w:tc>
-          <w:tcPr>
-            <w:tcW w:type="dxa" w:w="2160"/>
-          </w:tcPr>
-          <w:p>
-            <w:r/>
-            <w:r>
-              <w:rPr>
-                <w:rFonts w:ascii="Times New Roman" w:hAnsi="Times New Roman"/>
-                <w:b w:val="0"/>
-                <w:sz w:val="18"/>
-              </w:rPr>
-              <w:t>Explain the medical context and rationale for developing/validating the multivariable prediction model</w:t>
+              <w:t>Introduction</w:t>
             </w:r>
           </w:p>
         </w:tc>
@@ -333,7 +218,27 @@
           </w:tcPr>
           <w:p>
             <w:r>
-              <w:t>Introduction (Section 1)</w:t>
+              <w:t>3b</w:t>
+            </w:r>
+          </w:p>
+        </w:tc>
+        <w:tc>
+          <w:tcPr>
+            <w:tcW w:type="dxa" w:w="2160"/>
+          </w:tcPr>
+          <w:p>
+            <w:r>
+              <w:t>Specify objectives, including whether developing/validating</w:t>
+            </w:r>
+          </w:p>
+        </w:tc>
+        <w:tc>
+          <w:tcPr>
+            <w:tcW w:type="dxa" w:w="2160"/>
+          </w:tcPr>
+          <w:p>
+            <w:r>
+              <w:t>Introduction, final paragraph</w:t>
             </w:r>
           </w:p>
         </w:tc>
@@ -344,45 +249,8 @@
             <w:tcW w:type="dxa" w:w="2160"/>
           </w:tcPr>
           <w:p>
-            <w:r/>
             <w:r>
-              <w:rPr>
-                <w:rFonts w:ascii="Times New Roman" w:hAnsi="Times New Roman"/>
-                <w:b w:val="0"/>
-                <w:sz w:val="18"/>
-              </w:rPr>
-            </w:r>
-          </w:p>
-        </w:tc>
-        <w:tc>
-          <w:tcPr>
-            <w:tcW w:type="dxa" w:w="2160"/>
-          </w:tcPr>
-          <w:p>
-            <w:r/>
-            <w:r>
-              <w:rPr>
-                <w:rFonts w:ascii="Times New Roman" w:hAnsi="Times New Roman"/>
-                <w:b w:val="0"/>
-                <w:sz w:val="18"/>
-              </w:rPr>
-              <w:t>3b</w:t>
-            </w:r>
-          </w:p>
-        </w:tc>
-        <w:tc>
-          <w:tcPr>
-            <w:tcW w:type="dxa" w:w="2160"/>
-          </w:tcPr>
-          <w:p>
-            <w:r/>
-            <w:r>
-              <w:rPr>
-                <w:rFonts w:ascii="Times New Roman" w:hAnsi="Times New Roman"/>
-                <w:b w:val="0"/>
-                <w:sz w:val="18"/>
-              </w:rPr>
-              <w:t>Specify the objectives, including whether the study describes model development, validation, or both</w:t>
+              <w:t>Source of data</w:t>
             </w:r>
           </w:p>
         </w:tc>
@@ -392,7 +260,27 @@
           </w:tcPr>
           <w:p>
             <w:r>
-              <w:t>Introduction (Section 1, final paragraph)</w:t>
+              <w:t>4a</w:t>
+            </w:r>
+          </w:p>
+        </w:tc>
+        <w:tc>
+          <w:tcPr>
+            <w:tcW w:type="dxa" w:w="2160"/>
+          </w:tcPr>
+          <w:p>
+            <w:r>
+              <w:t>Describe the study design and data source</w:t>
+            </w:r>
+          </w:p>
+        </w:tc>
+        <w:tc>
+          <w:tcPr>
+            <w:tcW w:type="dxa" w:w="2160"/>
+          </w:tcPr>
+          <w:p>
+            <w:r>
+              <w:t>Materials and methods: Data source and preprocessing</w:t>
             </w:r>
           </w:p>
         </w:tc>
@@ -403,14 +291,8 @@
             <w:tcW w:type="dxa" w:w="2160"/>
           </w:tcPr>
           <w:p>
-            <w:r/>
             <w:r>
-              <w:rPr>
-                <w:rFonts w:ascii="Times New Roman" w:hAnsi="Times New Roman"/>
-                <w:b/>
-                <w:sz w:val="18"/>
-              </w:rPr>
-              <w:t>Methods</w:t>
+              <w:t>Source of data</w:t>
             </w:r>
           </w:p>
         </w:tc>
@@ -419,13 +301,8 @@
             <w:tcW w:type="dxa" w:w="2160"/>
           </w:tcPr>
           <w:p>
-            <w:r/>
             <w:r>
-              <w:rPr>
-                <w:rFonts w:ascii="Times New Roman" w:hAnsi="Times New Roman"/>
-                <w:b w:val="0"/>
-                <w:sz w:val="18"/>
-              </w:rPr>
+              <w:t>4b</w:t>
             </w:r>
           </w:p>
         </w:tc>
@@ -434,13 +311,8 @@
             <w:tcW w:type="dxa" w:w="2160"/>
           </w:tcPr>
           <w:p>
-            <w:r/>
             <w:r>
-              <w:rPr>
-                <w:rFonts w:ascii="Times New Roman" w:hAnsi="Times New Roman"/>
-                <w:b w:val="0"/>
-                <w:sz w:val="18"/>
-              </w:rPr>
+              <w:t>Specify dates of study period</w:t>
             </w:r>
           </w:p>
         </w:tc>
@@ -449,13 +321,8 @@
             <w:tcW w:type="dxa" w:w="2160"/>
           </w:tcPr>
           <w:p>
-            <w:r/>
             <w:r>
-              <w:rPr>
-                <w:rFonts w:ascii="Times New Roman" w:hAnsi="Times New Roman"/>
-                <w:b w:val="0"/>
-                <w:sz w:val="18"/>
-              </w:rPr>
+              <w:t>Materials and methods: Data source and preprocessing (2021Q1-2025Q4)</w:t>
             </w:r>
           </w:p>
         </w:tc>
@@ -466,46 +333,8 @@
             <w:tcW w:type="dxa" w:w="2160"/>
           </w:tcPr>
           <w:p>
-            <w:r/>
             <w:r>
-              <w:rPr>
-                <w:rFonts w:ascii="Times New Roman" w:hAnsi="Times New Roman"/>
-                <w:b w:val="0"/>
-                <w:sz w:val="18"/>
-              </w:rPr>
-              <w:t>Source of data</w:t>
-            </w:r>
-          </w:p>
-        </w:tc>
-        <w:tc>
-          <w:tcPr>
-            <w:tcW w:type="dxa" w:w="2160"/>
-          </w:tcPr>
-          <w:p>
-            <w:r/>
-            <w:r>
-              <w:rPr>
-                <w:rFonts w:ascii="Times New Roman" w:hAnsi="Times New Roman"/>
-                <w:b w:val="0"/>
-                <w:sz w:val="18"/>
-              </w:rPr>
-              <w:t>4a</w:t>
-            </w:r>
-          </w:p>
-        </w:tc>
-        <w:tc>
-          <w:tcPr>
-            <w:tcW w:type="dxa" w:w="2160"/>
-          </w:tcPr>
-          <w:p>
-            <w:r/>
-            <w:r>
-              <w:rPr>
-                <w:rFonts w:ascii="Times New Roman" w:hAnsi="Times New Roman"/>
-                <w:b w:val="0"/>
-                <w:sz w:val="18"/>
-              </w:rPr>
-              <w:t>Describe the study design or source of data</w:t>
+              <w:t>Participants</w:t>
             </w:r>
           </w:p>
         </w:tc>
@@ -515,7 +344,27 @@
           </w:tcPr>
           <w:p>
             <w:r>
-              <w:t>Methods, Data Curation, Cohort Construction, and Preprocessing (Section 2.3)</w:t>
+              <w:t>5a</w:t>
+            </w:r>
+          </w:p>
+        </w:tc>
+        <w:tc>
+          <w:tcPr>
+            <w:tcW w:type="dxa" w:w="2160"/>
+          </w:tcPr>
+          <w:p>
+            <w:r>
+              <w:t>Specify key eligibility criteria</w:t>
+            </w:r>
+          </w:p>
+        </w:tc>
+        <w:tc>
+          <w:tcPr>
+            <w:tcW w:type="dxa" w:w="2160"/>
+          </w:tcPr>
+          <w:p>
+            <w:r>
+              <w:t>Materials and methods: Research subjects (adolescents aged 12-17)</w:t>
             </w:r>
           </w:p>
         </w:tc>
@@ -526,45 +375,8 @@
             <w:tcW w:type="dxa" w:w="2160"/>
           </w:tcPr>
           <w:p>
-            <w:r/>
             <w:r>
-              <w:rPr>
-                <w:rFonts w:ascii="Times New Roman" w:hAnsi="Times New Roman"/>
-                <w:b w:val="0"/>
-                <w:sz w:val="18"/>
-              </w:rPr>
-            </w:r>
-          </w:p>
-        </w:tc>
-        <w:tc>
-          <w:tcPr>
-            <w:tcW w:type="dxa" w:w="2160"/>
-          </w:tcPr>
-          <w:p>
-            <w:r/>
-            <w:r>
-              <w:rPr>
-                <w:rFonts w:ascii="Times New Roman" w:hAnsi="Times New Roman"/>
-                <w:b w:val="0"/>
-                <w:sz w:val="18"/>
-              </w:rPr>
-              <w:t>4b</w:t>
-            </w:r>
-          </w:p>
-        </w:tc>
-        <w:tc>
-          <w:tcPr>
-            <w:tcW w:type="dxa" w:w="2160"/>
-          </w:tcPr>
-          <w:p>
-            <w:r/>
-            <w:r>
-              <w:rPr>
-                <w:rFonts w:ascii="Times New Roman" w:hAnsi="Times New Roman"/>
-                <w:b w:val="0"/>
-                <w:sz w:val="18"/>
-              </w:rPr>
-              <w:t>Specify the key study dates</w:t>
+              <w:t>Participants</w:t>
             </w:r>
           </w:p>
         </w:tc>
@@ -574,7 +386,27 @@
           </w:tcPr>
           <w:p>
             <w:r>
-              <w:t>Methods, Data Curation (Section 2.3); Dataset Partitioning and Leakage-Controlled Design (Section 2.4)</w:t>
+              <w:t>5b</w:t>
+            </w:r>
+          </w:p>
+        </w:tc>
+        <w:tc>
+          <w:tcPr>
+            <w:tcW w:type="dxa" w:w="2160"/>
+          </w:tcPr>
+          <w:p>
+            <w:r>
+              <w:t>Describe participant selection and data flow</w:t>
+            </w:r>
+          </w:p>
+        </w:tc>
+        <w:tc>
+          <w:tcPr>
+            <w:tcW w:type="dxa" w:w="2160"/>
+          </w:tcPr>
+          <w:p>
+            <w:r>
+              <w:t>Materials and methods: Research subjects; S1 Fig (flow diagram)</w:t>
             </w:r>
           </w:p>
         </w:tc>
@@ -585,46 +417,8 @@
             <w:tcW w:type="dxa" w:w="2160"/>
           </w:tcPr>
           <w:p>
-            <w:r/>
             <w:r>
-              <w:rPr>
-                <w:rFonts w:ascii="Times New Roman" w:hAnsi="Times New Roman"/>
-                <w:b w:val="0"/>
-                <w:sz w:val="18"/>
-              </w:rPr>
-              <w:t>Participants</w:t>
-            </w:r>
-          </w:p>
-        </w:tc>
-        <w:tc>
-          <w:tcPr>
-            <w:tcW w:type="dxa" w:w="2160"/>
-          </w:tcPr>
-          <w:p>
-            <w:r/>
-            <w:r>
-              <w:rPr>
-                <w:rFonts w:ascii="Times New Roman" w:hAnsi="Times New Roman"/>
-                <w:b w:val="0"/>
-                <w:sz w:val="18"/>
-              </w:rPr>
-              <w:t>5a</w:t>
-            </w:r>
-          </w:p>
-        </w:tc>
-        <w:tc>
-          <w:tcPr>
-            <w:tcW w:type="dxa" w:w="2160"/>
-          </w:tcPr>
-          <w:p>
-            <w:r/>
-            <w:r>
-              <w:rPr>
-                <w:rFonts w:ascii="Times New Roman" w:hAnsi="Times New Roman"/>
-                <w:b w:val="0"/>
-                <w:sz w:val="18"/>
-              </w:rPr>
-              <w:t>Specify key elements of the study setting</w:t>
+              <w:t>Outcome</w:t>
             </w:r>
           </w:p>
         </w:tc>
@@ -634,7 +428,27 @@
           </w:tcPr>
           <w:p>
             <w:r>
-              <w:t>Methods, Data Curation, Cohort Construction, and Preprocessing (Section 2.3)</w:t>
+              <w:t>6a</w:t>
+            </w:r>
+          </w:p>
+        </w:tc>
+        <w:tc>
+          <w:tcPr>
+            <w:tcW w:type="dxa" w:w="2160"/>
+          </w:tcPr>
+          <w:p>
+            <w:r>
+              <w:t>Clearly define the outcome</w:t>
+            </w:r>
+          </w:p>
+        </w:tc>
+        <w:tc>
+          <w:tcPr>
+            <w:tcW w:type="dxa" w:w="2160"/>
+          </w:tcPr>
+          <w:p>
+            <w:r>
+              <w:t>Materials and methods: Complementary machine-learning analysis (outc_cod: DE, LT, HO, DS, RI, OT)</w:t>
             </w:r>
           </w:p>
         </w:tc>
@@ -645,45 +459,8 @@
             <w:tcW w:type="dxa" w:w="2160"/>
           </w:tcPr>
           <w:p>
-            <w:r/>
             <w:r>
-              <w:rPr>
-                <w:rFonts w:ascii="Times New Roman" w:hAnsi="Times New Roman"/>
-                <w:b w:val="0"/>
-                <w:sz w:val="18"/>
-              </w:rPr>
-            </w:r>
-          </w:p>
-        </w:tc>
-        <w:tc>
-          <w:tcPr>
-            <w:tcW w:type="dxa" w:w="2160"/>
-          </w:tcPr>
-          <w:p>
-            <w:r/>
-            <w:r>
-              <w:rPr>
-                <w:rFonts w:ascii="Times New Roman" w:hAnsi="Times New Roman"/>
-                <w:b w:val="0"/>
-                <w:sz w:val="18"/>
-              </w:rPr>
-              <w:t>5b</w:t>
-            </w:r>
-          </w:p>
-        </w:tc>
-        <w:tc>
-          <w:tcPr>
-            <w:tcW w:type="dxa" w:w="2160"/>
-          </w:tcPr>
-          <w:p>
-            <w:r/>
-            <w:r>
-              <w:rPr>
-                <w:rFonts w:ascii="Times New Roman" w:hAnsi="Times New Roman"/>
-                <w:b w:val="0"/>
-                <w:sz w:val="18"/>
-              </w:rPr>
-              <w:t>Describe eligibility criteria for participants</w:t>
+              <w:t>Outcome</w:t>
             </w:r>
           </w:p>
         </w:tc>
@@ -693,7 +470,27 @@
           </w:tcPr>
           <w:p>
             <w:r>
-              <w:t>Methods, Data Curation, Cohort Construction, and Preprocessing (Section 2.3)</w:t>
+              <w:t>6b</w:t>
+            </w:r>
+          </w:p>
+        </w:tc>
+        <w:tc>
+          <w:tcPr>
+            <w:tcW w:type="dxa" w:w="2160"/>
+          </w:tcPr>
+          <w:p>
+            <w:r>
+              <w:t>Report timing of outcome assessment</w:t>
+            </w:r>
+          </w:p>
+        </w:tc>
+        <w:tc>
+          <w:tcPr>
+            <w:tcW w:type="dxa" w:w="2160"/>
+          </w:tcPr>
+          <w:p>
+            <w:r>
+              <w:t>Materials and methods: Complementary machine-learning analysis (FAERS report dates)</w:t>
             </w:r>
           </w:p>
         </w:tc>
@@ -704,45 +501,8 @@
             <w:tcW w:type="dxa" w:w="2160"/>
           </w:tcPr>
           <w:p>
-            <w:r/>
             <w:r>
-              <w:rPr>
-                <w:rFonts w:ascii="Times New Roman" w:hAnsi="Times New Roman"/>
-                <w:b w:val="0"/>
-                <w:sz w:val="18"/>
-              </w:rPr>
-            </w:r>
-          </w:p>
-        </w:tc>
-        <w:tc>
-          <w:tcPr>
-            <w:tcW w:type="dxa" w:w="2160"/>
-          </w:tcPr>
-          <w:p>
-            <w:r/>
-            <w:r>
-              <w:rPr>
-                <w:rFonts w:ascii="Times New Roman" w:hAnsi="Times New Roman"/>
-                <w:b w:val="0"/>
-                <w:sz w:val="18"/>
-              </w:rPr>
-              <w:t>5c</w:t>
-            </w:r>
-          </w:p>
-        </w:tc>
-        <w:tc>
-          <w:tcPr>
-            <w:tcW w:type="dxa" w:w="2160"/>
-          </w:tcPr>
-          <w:p>
-            <w:r/>
-            <w:r>
-              <w:rPr>
-                <w:rFonts w:ascii="Times New Roman" w:hAnsi="Times New Roman"/>
-                <w:b w:val="0"/>
-                <w:sz w:val="18"/>
-              </w:rPr>
-              <w:t>Give details of treatments received, if relevant</w:t>
+              <w:t>Predictors</w:t>
             </w:r>
           </w:p>
         </w:tc>
@@ -752,7 +512,27 @@
           </w:tcPr>
           <w:p>
             <w:r>
-              <w:t>Methods, Data Curation, Cohort Construction, and Preprocessing (Section 2.3); four pharmacotherapy panels</w:t>
+              <w:t>7a</w:t>
+            </w:r>
+          </w:p>
+        </w:tc>
+        <w:tc>
+          <w:tcPr>
+            <w:tcW w:type="dxa" w:w="2160"/>
+          </w:tcPr>
+          <w:p>
+            <w:r>
+              <w:t>Clearly define all predictors</w:t>
+            </w:r>
+          </w:p>
+        </w:tc>
+        <w:tc>
+          <w:tcPr>
+            <w:tcW w:type="dxa" w:w="2160"/>
+          </w:tcPr>
+          <w:p>
+            <w:r>
+              <w:t>Materials and methods: Complementary machine-learning analysis (13 features listed)</w:t>
             </w:r>
           </w:p>
         </w:tc>
@@ -763,46 +543,8 @@
             <w:tcW w:type="dxa" w:w="2160"/>
           </w:tcPr>
           <w:p>
-            <w:r/>
             <w:r>
-              <w:rPr>
-                <w:rFonts w:ascii="Times New Roman" w:hAnsi="Times New Roman"/>
-                <w:b w:val="0"/>
-                <w:sz w:val="18"/>
-              </w:rPr>
-              <w:t>Outcome</w:t>
-            </w:r>
-          </w:p>
-        </w:tc>
-        <w:tc>
-          <w:tcPr>
-            <w:tcW w:type="dxa" w:w="2160"/>
-          </w:tcPr>
-          <w:p>
-            <w:r/>
-            <w:r>
-              <w:rPr>
-                <w:rFonts w:ascii="Times New Roman" w:hAnsi="Times New Roman"/>
-                <w:b w:val="0"/>
-                <w:sz w:val="18"/>
-              </w:rPr>
-              <w:t>6a</w:t>
-            </w:r>
-          </w:p>
-        </w:tc>
-        <w:tc>
-          <w:tcPr>
-            <w:tcW w:type="dxa" w:w="2160"/>
-          </w:tcPr>
-          <w:p>
-            <w:r/>
-            <w:r>
-              <w:rPr>
-                <w:rFonts w:ascii="Times New Roman" w:hAnsi="Times New Roman"/>
-                <w:b w:val="0"/>
-                <w:sz w:val="18"/>
-              </w:rPr>
-              <w:t>Clearly define the outcome that is predicted by the prediction model</w:t>
+              <w:t>Predictors</w:t>
             </w:r>
           </w:p>
         </w:tc>
@@ -812,7 +554,27 @@
           </w:tcPr>
           <w:p>
             <w:r>
-              <w:t>Methods, Outcome Definition and Label Provenance (Section 2.3.1)</w:t>
+              <w:t>7b</w:t>
+            </w:r>
+          </w:p>
+        </w:tc>
+        <w:tc>
+          <w:tcPr>
+            <w:tcW w:type="dxa" w:w="2160"/>
+          </w:tcPr>
+          <w:p>
+            <w:r>
+              <w:t>Report handling of predictors</w:t>
+            </w:r>
+          </w:p>
+        </w:tc>
+        <w:tc>
+          <w:tcPr>
+            <w:tcW w:type="dxa" w:w="2160"/>
+          </w:tcPr>
+          <w:p>
+            <w:r>
+              <w:t>Materials and methods: Complementary machine-learning analysis; S6 Table</w:t>
             </w:r>
           </w:p>
         </w:tc>
@@ -823,45 +585,8 @@
             <w:tcW w:type="dxa" w:w="2160"/>
           </w:tcPr>
           <w:p>
-            <w:r/>
             <w:r>
-              <w:rPr>
-                <w:rFonts w:ascii="Times New Roman" w:hAnsi="Times New Roman"/>
-                <w:b w:val="0"/>
-                <w:sz w:val="18"/>
-              </w:rPr>
-            </w:r>
-          </w:p>
-        </w:tc>
-        <w:tc>
-          <w:tcPr>
-            <w:tcW w:type="dxa" w:w="2160"/>
-          </w:tcPr>
-          <w:p>
-            <w:r/>
-            <w:r>
-              <w:rPr>
-                <w:rFonts w:ascii="Times New Roman" w:hAnsi="Times New Roman"/>
-                <w:b w:val="0"/>
-                <w:sz w:val="18"/>
-              </w:rPr>
-              <w:t>6b</w:t>
-            </w:r>
-          </w:p>
-        </w:tc>
-        <w:tc>
-          <w:tcPr>
-            <w:tcW w:type="dxa" w:w="2160"/>
-          </w:tcPr>
-          <w:p>
-            <w:r/>
-            <w:r>
-              <w:rPr>
-                <w:rFonts w:ascii="Times New Roman" w:hAnsi="Times New Roman"/>
-                <w:b w:val="0"/>
-                <w:sz w:val="18"/>
-              </w:rPr>
-              <w:t>Report any actions to blind outcome assessment</w:t>
+              <w:t>Sample size</w:t>
             </w:r>
           </w:p>
         </w:tc>
@@ -871,7 +596,27 @@
           </w:tcPr>
           <w:p>
             <w:r>
-              <w:t>N/A (regulatory database; outcomes pre-recorded by the reporting source)</w:t>
+              <w:t>8</w:t>
+            </w:r>
+          </w:p>
+        </w:tc>
+        <w:tc>
+          <w:tcPr>
+            <w:tcW w:type="dxa" w:w="2160"/>
+          </w:tcPr>
+          <w:p>
+            <w:r>
+              <w:t>Explain how sample size was determined</w:t>
+            </w:r>
+          </w:p>
+        </w:tc>
+        <w:tc>
+          <w:tcPr>
+            <w:tcW w:type="dxa" w:w="2160"/>
+          </w:tcPr>
+          <w:p>
+            <w:r>
+              <w:t>Results: Basic characteristics (N=11,701 obesity; N=5,208 diabetes)</w:t>
             </w:r>
           </w:p>
         </w:tc>
@@ -882,46 +627,8 @@
             <w:tcW w:type="dxa" w:w="2160"/>
           </w:tcPr>
           <w:p>
-            <w:r/>
             <w:r>
-              <w:rPr>
-                <w:rFonts w:ascii="Times New Roman" w:hAnsi="Times New Roman"/>
-                <w:b w:val="0"/>
-                <w:sz w:val="18"/>
-              </w:rPr>
-              <w:t>Predictors</w:t>
-            </w:r>
-          </w:p>
-        </w:tc>
-        <w:tc>
-          <w:tcPr>
-            <w:tcW w:type="dxa" w:w="2160"/>
-          </w:tcPr>
-          <w:p>
-            <w:r/>
-            <w:r>
-              <w:rPr>
-                <w:rFonts w:ascii="Times New Roman" w:hAnsi="Times New Roman"/>
-                <w:b w:val="0"/>
-                <w:sz w:val="18"/>
-              </w:rPr>
-              <w:t>7a</w:t>
-            </w:r>
-          </w:p>
-        </w:tc>
-        <w:tc>
-          <w:tcPr>
-            <w:tcW w:type="dxa" w:w="2160"/>
-          </w:tcPr>
-          <w:p>
-            <w:r/>
-            <w:r>
-              <w:rPr>
-                <w:rFonts w:ascii="Times New Roman" w:hAnsi="Times New Roman"/>
-                <w:b w:val="0"/>
-                <w:sz w:val="18"/>
-              </w:rPr>
-              <w:t>Clearly define all predictors used in the model</w:t>
+              <w:t>Missing data</w:t>
             </w:r>
           </w:p>
         </w:tc>
@@ -931,7 +638,27 @@
           </w:tcPr>
           <w:p>
             <w:r>
-              <w:t>Methods, Predictors and Direct-Leakage Audit (Section 2.3.2); Table 1</w:t>
+              <w:t>9</w:t>
+            </w:r>
+          </w:p>
+        </w:tc>
+        <w:tc>
+          <w:tcPr>
+            <w:tcW w:type="dxa" w:w="2160"/>
+          </w:tcPr>
+          <w:p>
+            <w:r>
+              <w:t>Describe how missing data were handled</w:t>
+            </w:r>
+          </w:p>
+        </w:tc>
+        <w:tc>
+          <w:tcPr>
+            <w:tcW w:type="dxa" w:w="2160"/>
+          </w:tcPr>
+          <w:p>
+            <w:r>
+              <w:t>Materials and methods: Complementary machine-learning analysis (3-stage outcome-label handling)</w:t>
             </w:r>
           </w:p>
         </w:tc>
@@ -942,45 +669,8 @@
             <w:tcW w:type="dxa" w:w="2160"/>
           </w:tcPr>
           <w:p>
-            <w:r/>
             <w:r>
-              <w:rPr>
-                <w:rFonts w:ascii="Times New Roman" w:hAnsi="Times New Roman"/>
-                <w:b w:val="0"/>
-                <w:sz w:val="18"/>
-              </w:rPr>
-            </w:r>
-          </w:p>
-        </w:tc>
-        <w:tc>
-          <w:tcPr>
-            <w:tcW w:type="dxa" w:w="2160"/>
-          </w:tcPr>
-          <w:p>
-            <w:r/>
-            <w:r>
-              <w:rPr>
-                <w:rFonts w:ascii="Times New Roman" w:hAnsi="Times New Roman"/>
-                <w:b w:val="0"/>
-                <w:sz w:val="18"/>
-              </w:rPr>
-              <w:t>7b</w:t>
-            </w:r>
-          </w:p>
-        </w:tc>
-        <w:tc>
-          <w:tcPr>
-            <w:tcW w:type="dxa" w:w="2160"/>
-          </w:tcPr>
-          <w:p>
-            <w:r/>
-            <w:r>
-              <w:rPr>
-                <w:rFonts w:ascii="Times New Roman" w:hAnsi="Times New Roman"/>
-                <w:b w:val="0"/>
-                <w:sz w:val="18"/>
-              </w:rPr>
-              <w:t>Report any actions to blind predictor assessment</w:t>
+              <w:t>Statistical analysis</w:t>
             </w:r>
           </w:p>
         </w:tc>
@@ -990,7 +680,27 @@
           </w:tcPr>
           <w:p>
             <w:r>
-              <w:t>N/A (structured database fields)</w:t>
+              <w:t>10a</w:t>
+            </w:r>
+          </w:p>
+        </w:tc>
+        <w:tc>
+          <w:tcPr>
+            <w:tcW w:type="dxa" w:w="2160"/>
+          </w:tcPr>
+          <w:p>
+            <w:r>
+              <w:t>Describe how predictors were handled in analysis</w:t>
+            </w:r>
+          </w:p>
+        </w:tc>
+        <w:tc>
+          <w:tcPr>
+            <w:tcW w:type="dxa" w:w="2160"/>
+          </w:tcPr>
+          <w:p>
+            <w:r>
+              <w:t>Materials and methods: Data analysis (Table 1, Table 2); S5 Table</w:t>
             </w:r>
           </w:p>
         </w:tc>
@@ -1001,46 +711,8 @@
             <w:tcW w:type="dxa" w:w="2160"/>
           </w:tcPr>
           <w:p>
-            <w:r/>
             <w:r>
-              <w:rPr>
-                <w:rFonts w:ascii="Times New Roman" w:hAnsi="Times New Roman"/>
-                <w:b w:val="0"/>
-                <w:sz w:val="18"/>
-              </w:rPr>
-              <w:t>Sample size</w:t>
-            </w:r>
-          </w:p>
-        </w:tc>
-        <w:tc>
-          <w:tcPr>
-            <w:tcW w:type="dxa" w:w="2160"/>
-          </w:tcPr>
-          <w:p>
-            <w:r/>
-            <w:r>
-              <w:rPr>
-                <w:rFonts w:ascii="Times New Roman" w:hAnsi="Times New Roman"/>
-                <w:b w:val="0"/>
-                <w:sz w:val="18"/>
-              </w:rPr>
-              <w:t>8</w:t>
-            </w:r>
-          </w:p>
-        </w:tc>
-        <w:tc>
-          <w:tcPr>
-            <w:tcW w:type="dxa" w:w="2160"/>
-          </w:tcPr>
-          <w:p>
-            <w:r/>
-            <w:r>
-              <w:rPr>
-                <w:rFonts w:ascii="Times New Roman" w:hAnsi="Times New Roman"/>
-                <w:b w:val="0"/>
-                <w:sz w:val="18"/>
-              </w:rPr>
-              <w:t>Explain how the study size was arrived at</w:t>
+              <w:t>Statistical analysis</w:t>
             </w:r>
           </w:p>
         </w:tc>
@@ -1050,7 +722,27 @@
           </w:tcPr>
           <w:p>
             <w:r>
-              <w:t>Results, Cohort Construction, Data Quality, and Outcome Availability (Section 3.1)</w:t>
+              <w:t>10b</w:t>
+            </w:r>
+          </w:p>
+        </w:tc>
+        <w:tc>
+          <w:tcPr>
+            <w:tcW w:type="dxa" w:w="2160"/>
+          </w:tcPr>
+          <w:p>
+            <w:r>
+              <w:t>Specify type of model and model-building procedures</w:t>
+            </w:r>
+          </w:p>
+        </w:tc>
+        <w:tc>
+          <w:tcPr>
+            <w:tcW w:type="dxa" w:w="2160"/>
+          </w:tcPr>
+          <w:p>
+            <w:r>
+              <w:t>Materials and methods: Complementary machine-learning analysis (XGBoost)</w:t>
             </w:r>
           </w:p>
         </w:tc>
@@ -1061,46 +753,8 @@
             <w:tcW w:type="dxa" w:w="2160"/>
           </w:tcPr>
           <w:p>
-            <w:r/>
             <w:r>
-              <w:rPr>
-                <w:rFonts w:ascii="Times New Roman" w:hAnsi="Times New Roman"/>
-                <w:b w:val="0"/>
-                <w:sz w:val="18"/>
-              </w:rPr>
-              <w:t>Missing data</w:t>
-            </w:r>
-          </w:p>
-        </w:tc>
-        <w:tc>
-          <w:tcPr>
-            <w:tcW w:type="dxa" w:w="2160"/>
-          </w:tcPr>
-          <w:p>
-            <w:r/>
-            <w:r>
-              <w:rPr>
-                <w:rFonts w:ascii="Times New Roman" w:hAnsi="Times New Roman"/>
-                <w:b w:val="0"/>
-                <w:sz w:val="18"/>
-              </w:rPr>
-              <w:t>9</w:t>
-            </w:r>
-          </w:p>
-        </w:tc>
-        <w:tc>
-          <w:tcPr>
-            <w:tcW w:type="dxa" w:w="2160"/>
-          </w:tcPr>
-          <w:p>
-            <w:r/>
-            <w:r>
-              <w:rPr>
-                <w:rFonts w:ascii="Times New Roman" w:hAnsi="Times New Roman"/>
-                <w:b w:val="0"/>
-                <w:sz w:val="18"/>
-              </w:rPr>
-              <w:t>Describe how missing data were handled</w:t>
+              <w:t>Statistical analysis</w:t>
             </w:r>
           </w:p>
         </w:tc>
@@ -1110,7 +764,27 @@
           </w:tcPr>
           <w:p>
             <w:r>
-              <w:t>Methods, Missing Data and Encoding (Section 2.3.3)</w:t>
+              <w:t>10d</w:t>
+            </w:r>
+          </w:p>
+        </w:tc>
+        <w:tc>
+          <w:tcPr>
+            <w:tcW w:type="dxa" w:w="2160"/>
+          </w:tcPr>
+          <w:p>
+            <w:r>
+              <w:t>Specify all measures used to assess model performance</w:t>
+            </w:r>
+          </w:p>
+        </w:tc>
+        <w:tc>
+          <w:tcPr>
+            <w:tcW w:type="dxa" w:w="2160"/>
+          </w:tcPr>
+          <w:p>
+            <w:r>
+              <w:t>Materials and methods: Complementary machine-learning analysis (Macro-F1, McNemar test)</w:t>
             </w:r>
           </w:p>
         </w:tc>
@@ -1121,46 +795,8 @@
             <w:tcW w:type="dxa" w:w="2160"/>
           </w:tcPr>
           <w:p>
-            <w:r/>
             <w:r>
-              <w:rPr>
-                <w:rFonts w:ascii="Times New Roman" w:hAnsi="Times New Roman"/>
-                <w:b w:val="0"/>
-                <w:sz w:val="18"/>
-              </w:rPr>
-              <w:t>Statistical analysis</w:t>
-            </w:r>
-          </w:p>
-        </w:tc>
-        <w:tc>
-          <w:tcPr>
-            <w:tcW w:type="dxa" w:w="2160"/>
-          </w:tcPr>
-          <w:p>
-            <w:r/>
-            <w:r>
-              <w:rPr>
-                <w:rFonts w:ascii="Times New Roman" w:hAnsi="Times New Roman"/>
-                <w:b w:val="0"/>
-                <w:sz w:val="18"/>
-              </w:rPr>
-              <w:t>10a</w:t>
-            </w:r>
-          </w:p>
-        </w:tc>
-        <w:tc>
-          <w:tcPr>
-            <w:tcW w:type="dxa" w:w="2160"/>
-          </w:tcPr>
-          <w:p>
-            <w:r/>
-            <w:r>
-              <w:rPr>
-                <w:rFonts w:ascii="Times New Roman" w:hAnsi="Times New Roman"/>
-                <w:b w:val="0"/>
-                <w:sz w:val="18"/>
-              </w:rPr>
-              <w:t>Describe how predictors were handled in the analyses</w:t>
+              <w:t>Risk groups</w:t>
             </w:r>
           </w:p>
         </w:tc>
@@ -1170,7 +806,27 @@
           </w:tcPr>
           <w:p>
             <w:r>
-              <w:t>Methods, Baseline Models and Conventional Disproportionality Analysis (Section 2.5); Proposed Leakage-Aware ML Framework (Section 2.6)</w:t>
+              <w:t>11</w:t>
+            </w:r>
+          </w:p>
+        </w:tc>
+        <w:tc>
+          <w:tcPr>
+            <w:tcW w:type="dxa" w:w="2160"/>
+          </w:tcPr>
+          <w:p>
+            <w:r>
+              <w:t>Provide details on how risk groups were created</w:t>
+            </w:r>
+          </w:p>
+        </w:tc>
+        <w:tc>
+          <w:tcPr>
+            <w:tcW w:type="dxa" w:w="2160"/>
+          </w:tcPr>
+          <w:p>
+            <w:r>
+              <w:t>Not applicable (classification, not risk stratification)</w:t>
             </w:r>
           </w:p>
         </w:tc>
@@ -1181,45 +837,8 @@
             <w:tcW w:type="dxa" w:w="2160"/>
           </w:tcPr>
           <w:p>
-            <w:r/>
             <w:r>
-              <w:rPr>
-                <w:rFonts w:ascii="Times New Roman" w:hAnsi="Times New Roman"/>
-                <w:b w:val="0"/>
-                <w:sz w:val="18"/>
-              </w:rPr>
-            </w:r>
-          </w:p>
-        </w:tc>
-        <w:tc>
-          <w:tcPr>
-            <w:tcW w:type="dxa" w:w="2160"/>
-          </w:tcPr>
-          <w:p>
-            <w:r/>
-            <w:r>
-              <w:rPr>
-                <w:rFonts w:ascii="Times New Roman" w:hAnsi="Times New Roman"/>
-                <w:b w:val="0"/>
-                <w:sz w:val="18"/>
-              </w:rPr>
-              <w:t>10b</w:t>
-            </w:r>
-          </w:p>
-        </w:tc>
-        <w:tc>
-          <w:tcPr>
-            <w:tcW w:type="dxa" w:w="2160"/>
-          </w:tcPr>
-          <w:p>
-            <w:r/>
-            <w:r>
-              <w:rPr>
-                <w:rFonts w:ascii="Times New Roman" w:hAnsi="Times New Roman"/>
-                <w:b w:val="0"/>
-                <w:sz w:val="18"/>
-              </w:rPr>
-              <w:t>Specify type of model, all model-building procedures, and method for internal validation</w:t>
+              <w:t>Participants</w:t>
             </w:r>
           </w:p>
         </w:tc>
@@ -1229,7 +848,27 @@
           </w:tcPr>
           <w:p>
             <w:r>
-              <w:t>Methods, Sections 2.5–2.6</w:t>
+              <w:t>13a</w:t>
+            </w:r>
+          </w:p>
+        </w:tc>
+        <w:tc>
+          <w:tcPr>
+            <w:tcW w:type="dxa" w:w="2160"/>
+          </w:tcPr>
+          <w:p>
+            <w:r>
+              <w:t>Describe flow of participants</w:t>
+            </w:r>
+          </w:p>
+        </w:tc>
+        <w:tc>
+          <w:tcPr>
+            <w:tcW w:type="dxa" w:w="2160"/>
+          </w:tcPr>
+          <w:p>
+            <w:r>
+              <w:t>Results: Flowchart of reporting; S1 Fig</w:t>
             </w:r>
           </w:p>
         </w:tc>
@@ -1240,45 +879,8 @@
             <w:tcW w:type="dxa" w:w="2160"/>
           </w:tcPr>
           <w:p>
-            <w:r/>
             <w:r>
-              <w:rPr>
-                <w:rFonts w:ascii="Times New Roman" w:hAnsi="Times New Roman"/>
-                <w:b w:val="0"/>
-                <w:sz w:val="18"/>
-              </w:rPr>
-            </w:r>
-          </w:p>
-        </w:tc>
-        <w:tc>
-          <w:tcPr>
-            <w:tcW w:type="dxa" w:w="2160"/>
-          </w:tcPr>
-          <w:p>
-            <w:r/>
-            <w:r>
-              <w:rPr>
-                <w:rFonts w:ascii="Times New Roman" w:hAnsi="Times New Roman"/>
-                <w:b w:val="0"/>
-                <w:sz w:val="18"/>
-              </w:rPr>
-              <w:t>10d</w:t>
-            </w:r>
-          </w:p>
-        </w:tc>
-        <w:tc>
-          <w:tcPr>
-            <w:tcW w:type="dxa" w:w="2160"/>
-          </w:tcPr>
-          <w:p>
-            <w:r/>
-            <w:r>
-              <w:rPr>
-                <w:rFonts w:ascii="Times New Roman" w:hAnsi="Times New Roman"/>
-                <w:b w:val="0"/>
-                <w:sz w:val="18"/>
-              </w:rPr>
-              <w:t>Specify all measures used to assess model performance and, if relevant, to compare multiple models</w:t>
+              <w:t>Participants</w:t>
             </w:r>
           </w:p>
         </w:tc>
@@ -1288,7 +890,27 @@
           </w:tcPr>
           <w:p>
             <w:r>
-              <w:t>Methods, Evaluation, Explainability, and Statistical Analysis (Section 2.7)</w:t>
+              <w:t>13b</w:t>
+            </w:r>
+          </w:p>
+        </w:tc>
+        <w:tc>
+          <w:tcPr>
+            <w:tcW w:type="dxa" w:w="2160"/>
+          </w:tcPr>
+          <w:p>
+            <w:r>
+              <w:t>Describe participant characteristics</w:t>
+            </w:r>
+          </w:p>
+        </w:tc>
+        <w:tc>
+          <w:tcPr>
+            <w:tcW w:type="dxa" w:w="2160"/>
+          </w:tcPr>
+          <w:p>
+            <w:r>
+              <w:t>Results: Basic characteristics; Table 3</w:t>
             </w:r>
           </w:p>
         </w:tc>
@@ -1299,46 +921,8 @@
             <w:tcW w:type="dxa" w:w="2160"/>
           </w:tcPr>
           <w:p>
-            <w:r/>
             <w:r>
-              <w:rPr>
-                <w:rFonts w:ascii="Times New Roman" w:hAnsi="Times New Roman"/>
-                <w:b w:val="0"/>
-                <w:sz w:val="18"/>
-              </w:rPr>
-              <w:t>Risk groups</w:t>
-            </w:r>
-          </w:p>
-        </w:tc>
-        <w:tc>
-          <w:tcPr>
-            <w:tcW w:type="dxa" w:w="2160"/>
-          </w:tcPr>
-          <w:p>
-            <w:r/>
-            <w:r>
-              <w:rPr>
-                <w:rFonts w:ascii="Times New Roman" w:hAnsi="Times New Roman"/>
-                <w:b w:val="0"/>
-                <w:sz w:val="18"/>
-              </w:rPr>
-              <w:t>11</w:t>
-            </w:r>
-          </w:p>
-        </w:tc>
-        <w:tc>
-          <w:tcPr>
-            <w:tcW w:type="dxa" w:w="2160"/>
-          </w:tcPr>
-          <w:p>
-            <w:r/>
-            <w:r>
-              <w:rPr>
-                <w:rFonts w:ascii="Times New Roman" w:hAnsi="Times New Roman"/>
-                <w:b w:val="0"/>
-                <w:sz w:val="18"/>
-              </w:rPr>
-              <w:t>Provide details on how risk groups were created, if done</w:t>
+              <w:t>Model performance</w:t>
             </w:r>
           </w:p>
         </w:tc>
@@ -1348,7 +932,27 @@
           </w:tcPr>
           <w:p>
             <w:r>
-              <w:t>Results, Operational Utility: Risk Stratification and Triage (Section 3.2.1)</w:t>
+              <w:t>16</w:t>
+            </w:r>
+          </w:p>
+        </w:tc>
+        <w:tc>
+          <w:tcPr>
+            <w:tcW w:type="dxa" w:w="2160"/>
+          </w:tcPr>
+          <w:p>
+            <w:r>
+              <w:t>Report performance measures with CIs</w:t>
+            </w:r>
+          </w:p>
+        </w:tc>
+        <w:tc>
+          <w:tcPr>
+            <w:tcW w:type="dxa" w:w="2160"/>
+          </w:tcPr>
+          <w:p>
+            <w:r>
+              <w:t>Results: Complementary ML-augmented signal validation; Table 4</w:t>
             </w:r>
           </w:p>
         </w:tc>
@@ -1359,14 +963,8 @@
             <w:tcW w:type="dxa" w:w="2160"/>
           </w:tcPr>
           <w:p>
-            <w:r/>
             <w:r>
-              <w:rPr>
-                <w:rFonts w:ascii="Times New Roman" w:hAnsi="Times New Roman"/>
-                <w:b/>
-                <w:sz w:val="18"/>
-              </w:rPr>
-              <w:t>AI-specific</w:t>
+              <w:t>Model updating</w:t>
             </w:r>
           </w:p>
         </w:tc>
@@ -1375,13 +973,8 @@
             <w:tcW w:type="dxa" w:w="2160"/>
           </w:tcPr>
           <w:p>
-            <w:r/>
             <w:r>
-              <w:rPr>
-                <w:rFonts w:ascii="Times New Roman" w:hAnsi="Times New Roman"/>
-                <w:b w:val="0"/>
-                <w:sz w:val="18"/>
-              </w:rPr>
+              <w:t>17</w:t>
             </w:r>
           </w:p>
         </w:tc>
@@ -1390,13 +983,8 @@
             <w:tcW w:type="dxa" w:w="2160"/>
           </w:tcPr>
           <w:p>
-            <w:r/>
             <w:r>
-              <w:rPr>
-                <w:rFonts w:ascii="Times New Roman" w:hAnsi="Times New Roman"/>
-                <w:b w:val="0"/>
-                <w:sz w:val="18"/>
-              </w:rPr>
+              <w:t>Report results of model updating</w:t>
             </w:r>
           </w:p>
         </w:tc>
@@ -1405,13 +993,8 @@
             <w:tcW w:type="dxa" w:w="2160"/>
           </w:tcPr>
           <w:p>
-            <w:r/>
             <w:r>
-              <w:rPr>
-                <w:rFonts w:ascii="Times New Roman" w:hAnsi="Times New Roman"/>
-                <w:b w:val="0"/>
-                <w:sz w:val="18"/>
-              </w:rPr>
+              <w:t>Not applicable</w:t>
             </w:r>
           </w:p>
         </w:tc>
@@ -1422,46 +1005,8 @@
             <w:tcW w:type="dxa" w:w="2160"/>
           </w:tcPr>
           <w:p>
-            <w:r/>
             <w:r>
-              <w:rPr>
-                <w:rFonts w:ascii="Times New Roman" w:hAnsi="Times New Roman"/>
-                <w:b w:val="0"/>
-                <w:sz w:val="18"/>
-              </w:rPr>
-              <w:t>AI method</w:t>
-            </w:r>
-          </w:p>
-        </w:tc>
-        <w:tc>
-          <w:tcPr>
-            <w:tcW w:type="dxa" w:w="2160"/>
-          </w:tcPr>
-          <w:p>
-            <w:r/>
-            <w:r>
-              <w:rPr>
-                <w:rFonts w:ascii="Times New Roman" w:hAnsi="Times New Roman"/>
-                <w:b w:val="0"/>
-                <w:sz w:val="18"/>
-              </w:rPr>
-              <w:t>AI-1</w:t>
-            </w:r>
-          </w:p>
-        </w:tc>
-        <w:tc>
-          <w:tcPr>
-            <w:tcW w:type="dxa" w:w="2160"/>
-          </w:tcPr>
-          <w:p>
-            <w:r/>
-            <w:r>
-              <w:rPr>
-                <w:rFonts w:ascii="Times New Roman" w:hAnsi="Times New Roman"/>
-                <w:b w:val="0"/>
-                <w:sz w:val="18"/>
-              </w:rPr>
-              <w:t>Describe the AI/ML method used, including architecture, training procedure, and software</w:t>
+              <w:t>Discussion</w:t>
             </w:r>
           </w:p>
         </w:tc>
@@ -1471,7 +1016,27 @@
           </w:tcPr>
           <w:p>
             <w:r>
-              <w:t>Methods, Proposed Leakage-Aware Machine-Learning Framework (Section 2.6); S5 Table</w:t>
+              <w:t>18</w:t>
+            </w:r>
+          </w:p>
+        </w:tc>
+        <w:tc>
+          <w:tcPr>
+            <w:tcW w:type="dxa" w:w="2160"/>
+          </w:tcPr>
+          <w:p>
+            <w:r>
+              <w:t>Discuss limitations</w:t>
+            </w:r>
+          </w:p>
+        </w:tc>
+        <w:tc>
+          <w:tcPr>
+            <w:tcW w:type="dxa" w:w="2160"/>
+          </w:tcPr>
+          <w:p>
+            <w:r>
+              <w:t>Discussion: Strengths and limitations</w:t>
             </w:r>
           </w:p>
         </w:tc>
@@ -1482,46 +1047,8 @@
             <w:tcW w:type="dxa" w:w="2160"/>
           </w:tcPr>
           <w:p>
-            <w:r/>
             <w:r>
-              <w:rPr>
-                <w:rFonts w:ascii="Times New Roman" w:hAnsi="Times New Roman"/>
-                <w:b w:val="0"/>
-                <w:sz w:val="18"/>
-              </w:rPr>
-              <w:t>Feature engineering</w:t>
-            </w:r>
-          </w:p>
-        </w:tc>
-        <w:tc>
-          <w:tcPr>
-            <w:tcW w:type="dxa" w:w="2160"/>
-          </w:tcPr>
-          <w:p>
-            <w:r/>
-            <w:r>
-              <w:rPr>
-                <w:rFonts w:ascii="Times New Roman" w:hAnsi="Times New Roman"/>
-                <w:b w:val="0"/>
-                <w:sz w:val="18"/>
-              </w:rPr>
-              <w:t>AI-2</w:t>
-            </w:r>
-          </w:p>
-        </w:tc>
-        <w:tc>
-          <w:tcPr>
-            <w:tcW w:type="dxa" w:w="2160"/>
-          </w:tcPr>
-          <w:p>
-            <w:r/>
-            <w:r>
-              <w:rPr>
-                <w:rFonts w:ascii="Times New Roman" w:hAnsi="Times New Roman"/>
-                <w:b w:val="0"/>
-                <w:sz w:val="18"/>
-              </w:rPr>
-              <w:t>Describe any feature engineering, selection, or transformation</w:t>
+              <w:t>Discussion</w:t>
             </w:r>
           </w:p>
         </w:tc>
@@ -1531,7 +1058,27 @@
           </w:tcPr>
           <w:p>
             <w:r>
-              <w:t>Methods, Predictors and Direct-Leakage Audit (Section 2.3.2); Table 1</w:t>
+              <w:t>19a</w:t>
+            </w:r>
+          </w:p>
+        </w:tc>
+        <w:tc>
+          <w:tcPr>
+            <w:tcW w:type="dxa" w:w="2160"/>
+          </w:tcPr>
+          <w:p>
+            <w:r>
+              <w:t>Discuss potential clinical use and implications</w:t>
+            </w:r>
+          </w:p>
+        </w:tc>
+        <w:tc>
+          <w:tcPr>
+            <w:tcW w:type="dxa" w:w="2160"/>
+          </w:tcPr>
+          <w:p>
+            <w:r>
+              <w:t>Discussion, paragraphs 1-4; Conclusion</w:t>
             </w:r>
           </w:p>
         </w:tc>
@@ -1542,46 +1089,8 @@
             <w:tcW w:type="dxa" w:w="2160"/>
           </w:tcPr>
           <w:p>
-            <w:r/>
             <w:r>
-              <w:rPr>
-                <w:rFonts w:ascii="Times New Roman" w:hAnsi="Times New Roman"/>
-                <w:b w:val="0"/>
-                <w:sz w:val="18"/>
-              </w:rPr>
-              <w:t>Hyperparameter tuning</w:t>
-            </w:r>
-          </w:p>
-        </w:tc>
-        <w:tc>
-          <w:tcPr>
-            <w:tcW w:type="dxa" w:w="2160"/>
-          </w:tcPr>
-          <w:p>
-            <w:r/>
-            <w:r>
-              <w:rPr>
-                <w:rFonts w:ascii="Times New Roman" w:hAnsi="Times New Roman"/>
-                <w:b w:val="0"/>
-                <w:sz w:val="18"/>
-              </w:rPr>
-              <w:t>AI-3</w:t>
-            </w:r>
-          </w:p>
-        </w:tc>
-        <w:tc>
-          <w:tcPr>
-            <w:tcW w:type="dxa" w:w="2160"/>
-          </w:tcPr>
-          <w:p>
-            <w:r/>
-            <w:r>
-              <w:rPr>
-                <w:rFonts w:ascii="Times New Roman" w:hAnsi="Times New Roman"/>
-                <w:b w:val="0"/>
-                <w:sz w:val="18"/>
-              </w:rPr>
-              <w:t>Describe hyperparameter tuning procedure</w:t>
+              <w:t>Discussion</w:t>
             </w:r>
           </w:p>
         </w:tc>
@@ -1591,7 +1100,27 @@
           </w:tcPr>
           <w:p>
             <w:r>
-              <w:t>Methods, Proposed Leakage-Aware Machine-Learning Framework (Section 2.6); S5 Table</w:t>
+              <w:t>19b</w:t>
+            </w:r>
+          </w:p>
+        </w:tc>
+        <w:tc>
+          <w:tcPr>
+            <w:tcW w:type="dxa" w:w="2160"/>
+          </w:tcPr>
+          <w:p>
+            <w:r>
+              <w:t>Discuss implications for future research</w:t>
+            </w:r>
+          </w:p>
+        </w:tc>
+        <w:tc>
+          <w:tcPr>
+            <w:tcW w:type="dxa" w:w="2160"/>
+          </w:tcPr>
+          <w:p>
+            <w:r>
+              <w:t>Discussion: Future research</w:t>
             </w:r>
           </w:p>
         </w:tc>
@@ -1602,46 +1131,8 @@
             <w:tcW w:type="dxa" w:w="2160"/>
           </w:tcPr>
           <w:p>
-            <w:r/>
             <w:r>
-              <w:rPr>
-                <w:rFonts w:ascii="Times New Roman" w:hAnsi="Times New Roman"/>
-                <w:b w:val="0"/>
-                <w:sz w:val="18"/>
-              </w:rPr>
-              <w:t>Explainability</w:t>
-            </w:r>
-          </w:p>
-        </w:tc>
-        <w:tc>
-          <w:tcPr>
-            <w:tcW w:type="dxa" w:w="2160"/>
-          </w:tcPr>
-          <w:p>
-            <w:r/>
-            <w:r>
-              <w:rPr>
-                <w:rFonts w:ascii="Times New Roman" w:hAnsi="Times New Roman"/>
-                <w:b w:val="0"/>
-                <w:sz w:val="18"/>
-              </w:rPr>
-              <w:t>AI-4</w:t>
-            </w:r>
-          </w:p>
-        </w:tc>
-        <w:tc>
-          <w:tcPr>
-            <w:tcW w:type="dxa" w:w="2160"/>
-          </w:tcPr>
-          <w:p>
-            <w:r/>
-            <w:r>
-              <w:rPr>
-                <w:rFonts w:ascii="Times New Roman" w:hAnsi="Times New Roman"/>
-                <w:b w:val="0"/>
-                <w:sz w:val="18"/>
-              </w:rPr>
-              <w:t>Report explainability/interpretability methods used</w:t>
+              <w:t>Supplementary</w:t>
             </w:r>
           </w:p>
         </w:tc>
@@ -1651,7 +1142,27 @@
           </w:tcPr>
           <w:p>
             <w:r>
-              <w:t>Methods, Evaluation, Explainability, and Statistical Analysis (Section 2.7); Results, Explainability and Error Analysis (Section 3.7); Fig 3</w:t>
+              <w:t>21</w:t>
+            </w:r>
+          </w:p>
+        </w:tc>
+        <w:tc>
+          <w:tcPr>
+            <w:tcW w:type="dxa" w:w="2160"/>
+          </w:tcPr>
+          <w:p>
+            <w:r>
+              <w:t>Provide supplementary information</w:t>
+            </w:r>
+          </w:p>
+        </w:tc>
+        <w:tc>
+          <w:tcPr>
+            <w:tcW w:type="dxa" w:w="2160"/>
+          </w:tcPr>
+          <w:p>
+            <w:r>
+              <w:t>Supporting information: S1-S9 Tables, S1-S2 Figs</w:t>
             </w:r>
           </w:p>
         </w:tc>
@@ -1662,14 +1173,8 @@
             <w:tcW w:type="dxa" w:w="2160"/>
           </w:tcPr>
           <w:p>
-            <w:r/>
             <w:r>
-              <w:rPr>
-                <w:rFonts w:ascii="Times New Roman" w:hAnsi="Times New Roman"/>
-                <w:b/>
-                <w:sz w:val="18"/>
-              </w:rPr>
-              <w:t>Results</w:t>
+              <w:t>AI-specific: Data</w:t>
             </w:r>
           </w:p>
         </w:tc>
@@ -1678,13 +1183,8 @@
             <w:tcW w:type="dxa" w:w="2160"/>
           </w:tcPr>
           <w:p>
-            <w:r/>
             <w:r>
-              <w:rPr>
-                <w:rFonts w:ascii="Times New Roman" w:hAnsi="Times New Roman"/>
-                <w:b w:val="0"/>
-                <w:sz w:val="18"/>
-              </w:rPr>
+              <w:t>D1</w:t>
             </w:r>
           </w:p>
         </w:tc>
@@ -1693,13 +1193,8 @@
             <w:tcW w:type="dxa" w:w="2160"/>
           </w:tcPr>
           <w:p>
-            <w:r/>
             <w:r>
-              <w:rPr>
-                <w:rFonts w:ascii="Times New Roman" w:hAnsi="Times New Roman"/>
-                <w:b w:val="0"/>
-                <w:sz w:val="18"/>
-              </w:rPr>
+              <w:t>Describe data preprocessing and feature engineering</w:t>
             </w:r>
           </w:p>
         </w:tc>
@@ -1708,13 +1203,8 @@
             <w:tcW w:type="dxa" w:w="2160"/>
           </w:tcPr>
           <w:p>
-            <w:r/>
             <w:r>
-              <w:rPr>
-                <w:rFonts w:ascii="Times New Roman" w:hAnsi="Times New Roman"/>
-                <w:b w:val="0"/>
-                <w:sz w:val="18"/>
-              </w:rPr>
+              <w:t>Materials and methods: Data source and preprocessing; S4 Table</w:t>
             </w:r>
           </w:p>
         </w:tc>
@@ -1725,46 +1215,8 @@
             <w:tcW w:type="dxa" w:w="2160"/>
           </w:tcPr>
           <w:p>
-            <w:r/>
             <w:r>
-              <w:rPr>
-                <w:rFonts w:ascii="Times New Roman" w:hAnsi="Times New Roman"/>
-                <w:b w:val="0"/>
-                <w:sz w:val="18"/>
-              </w:rPr>
-              <w:t>Participants</w:t>
-            </w:r>
-          </w:p>
-        </w:tc>
-        <w:tc>
-          <w:tcPr>
-            <w:tcW w:type="dxa" w:w="2160"/>
-          </w:tcPr>
-          <w:p>
-            <w:r/>
-            <w:r>
-              <w:rPr>
-                <w:rFonts w:ascii="Times New Roman" w:hAnsi="Times New Roman"/>
-                <w:b w:val="0"/>
-                <w:sz w:val="18"/>
-              </w:rPr>
-              <w:t>13a</w:t>
-            </w:r>
-          </w:p>
-        </w:tc>
-        <w:tc>
-          <w:tcPr>
-            <w:tcW w:type="dxa" w:w="2160"/>
-          </w:tcPr>
-          <w:p>
-            <w:r/>
-            <w:r>
-              <w:rPr>
-                <w:rFonts w:ascii="Times New Roman" w:hAnsi="Times New Roman"/>
-                <w:b w:val="0"/>
-                <w:sz w:val="18"/>
-              </w:rPr>
-              <w:t>Describe the flow of participants through the study</w:t>
+              <w:t>AI-specific: Model</w:t>
             </w:r>
           </w:p>
         </w:tc>
@@ -1774,7 +1226,27 @@
           </w:tcPr>
           <w:p>
             <w:r>
-              <w:t>Results, Cohort Construction, Data Quality, and Outcome Availability (Section 3.1); Fig 2</w:t>
+              <w:t>M1</w:t>
+            </w:r>
+          </w:p>
+        </w:tc>
+        <w:tc>
+          <w:tcPr>
+            <w:tcW w:type="dxa" w:w="2160"/>
+          </w:tcPr>
+          <w:p>
+            <w:r>
+              <w:t>Specify model architecture and training procedure</w:t>
+            </w:r>
+          </w:p>
+        </w:tc>
+        <w:tc>
+          <w:tcPr>
+            <w:tcW w:type="dxa" w:w="2160"/>
+          </w:tcPr>
+          <w:p>
+            <w:r>
+              <w:t>Materials and methods: Complementary machine-learning analysis; S5 Table</w:t>
             </w:r>
           </w:p>
         </w:tc>
@@ -1785,45 +1257,8 @@
             <w:tcW w:type="dxa" w:w="2160"/>
           </w:tcPr>
           <w:p>
-            <w:r/>
             <w:r>
-              <w:rPr>
-                <w:rFonts w:ascii="Times New Roman" w:hAnsi="Times New Roman"/>
-                <w:b w:val="0"/>
-                <w:sz w:val="18"/>
-              </w:rPr>
-            </w:r>
-          </w:p>
-        </w:tc>
-        <w:tc>
-          <w:tcPr>
-            <w:tcW w:type="dxa" w:w="2160"/>
-          </w:tcPr>
-          <w:p>
-            <w:r/>
-            <w:r>
-              <w:rPr>
-                <w:rFonts w:ascii="Times New Roman" w:hAnsi="Times New Roman"/>
-                <w:b w:val="0"/>
-                <w:sz w:val="18"/>
-              </w:rPr>
-              <w:t>13b</w:t>
-            </w:r>
-          </w:p>
-        </w:tc>
-        <w:tc>
-          <w:tcPr>
-            <w:tcW w:type="dxa" w:w="2160"/>
-          </w:tcPr>
-          <w:p>
-            <w:r/>
-            <w:r>
-              <w:rPr>
-                <w:rFonts w:ascii="Times New Roman" w:hAnsi="Times New Roman"/>
-                <w:b w:val="0"/>
-                <w:sz w:val="18"/>
-              </w:rPr>
-              <w:t>Describe the characteristics of the participants</w:t>
+              <w:t>AI-specific: Model</w:t>
             </w:r>
           </w:p>
         </w:tc>
@@ -1833,7 +1268,27 @@
           </w:tcPr>
           <w:p>
             <w:r>
-              <w:t>Results, Cohort Construction, Data Quality, and Outcome Availability (Section 3.1); Table 2</w:t>
+              <w:t>M2</w:t>
+            </w:r>
+          </w:p>
+        </w:tc>
+        <w:tc>
+          <w:tcPr>
+            <w:tcW w:type="dxa" w:w="2160"/>
+          </w:tcPr>
+          <w:p>
+            <w:r>
+              <w:t>Describe measures to prevent data leakage</w:t>
+            </w:r>
+          </w:p>
+        </w:tc>
+        <w:tc>
+          <w:tcPr>
+            <w:tcW w:type="dxa" w:w="2160"/>
+          </w:tcPr>
+          <w:p>
+            <w:r>
+              <w:t>Materials and methods: Complementary machine-learning analysis (leakage-aware, 13 features); S6 Table</w:t>
             </w:r>
           </w:p>
         </w:tc>
@@ -1844,46 +1299,8 @@
             <w:tcW w:type="dxa" w:w="2160"/>
           </w:tcPr>
           <w:p>
-            <w:r/>
             <w:r>
-              <w:rPr>
-                <w:rFonts w:ascii="Times New Roman" w:hAnsi="Times New Roman"/>
-                <w:b w:val="0"/>
-                <w:sz w:val="18"/>
-              </w:rPr>
-              <w:t>Model development</w:t>
-            </w:r>
-          </w:p>
-        </w:tc>
-        <w:tc>
-          <w:tcPr>
-            <w:tcW w:type="dxa" w:w="2160"/>
-          </w:tcPr>
-          <w:p>
-            <w:r/>
-            <w:r>
-              <w:rPr>
-                <w:rFonts w:ascii="Times New Roman" w:hAnsi="Times New Roman"/>
-                <w:b w:val="0"/>
-                <w:sz w:val="18"/>
-              </w:rPr>
-              <w:t>14a</w:t>
-            </w:r>
-          </w:p>
-        </w:tc>
-        <w:tc>
-          <w:tcPr>
-            <w:tcW w:type="dxa" w:w="2160"/>
-          </w:tcPr>
-          <w:p>
-            <w:r/>
-            <w:r>
-              <w:rPr>
-                <w:rFonts w:ascii="Times New Roman" w:hAnsi="Times New Roman"/>
-                <w:b w:val="0"/>
-                <w:sz w:val="18"/>
-              </w:rPr>
-              <w:t>Specify the number of participants and outcome events in each analysis</w:t>
+              <w:t>AI-specific: Performance</w:t>
             </w:r>
           </w:p>
         </w:tc>
@@ -1893,7 +1310,27 @@
           </w:tcPr>
           <w:p>
             <w:r>
-              <w:t>Results, Cohort Construction, Data Quality, and Outcome Availability (Section 3.1); Table 8</w:t>
+              <w:t>P1</w:t>
+            </w:r>
+          </w:p>
+        </w:tc>
+        <w:tc>
+          <w:tcPr>
+            <w:tcW w:type="dxa" w:w="2160"/>
+          </w:tcPr>
+          <w:p>
+            <w:r>
+              <w:t>Report AI-specific evaluation metrics</w:t>
+            </w:r>
+          </w:p>
+        </w:tc>
+        <w:tc>
+          <w:tcPr>
+            <w:tcW w:type="dxa" w:w="2160"/>
+          </w:tcPr>
+          <w:p>
+            <w:r>
+              <w:t>Results: Complementary ML-augmented signal validation (Macro-F1 temporal=0.402, random=0.635)</w:t>
             </w:r>
           </w:p>
         </w:tc>
@@ -1904,46 +1341,8 @@
             <w:tcW w:type="dxa" w:w="2160"/>
           </w:tcPr>
           <w:p>
-            <w:r/>
             <w:r>
-              <w:rPr>
-                <w:rFonts w:ascii="Times New Roman" w:hAnsi="Times New Roman"/>
-                <w:b w:val="0"/>
-                <w:sz w:val="18"/>
-              </w:rPr>
-              <w:t>Model performance</w:t>
-            </w:r>
-          </w:p>
-        </w:tc>
-        <w:tc>
-          <w:tcPr>
-            <w:tcW w:type="dxa" w:w="2160"/>
-          </w:tcPr>
-          <w:p>
-            <w:r/>
-            <w:r>
-              <w:rPr>
-                <w:rFonts w:ascii="Times New Roman" w:hAnsi="Times New Roman"/>
-                <w:b w:val="0"/>
-                <w:sz w:val="18"/>
-              </w:rPr>
-              <w:t>15a</w:t>
-            </w:r>
-          </w:p>
-        </w:tc>
-        <w:tc>
-          <w:tcPr>
-            <w:tcW w:type="dxa" w:w="2160"/>
-          </w:tcPr>
-          <w:p>
-            <w:r/>
-            <w:r>
-              <w:rPr>
-                <w:rFonts w:ascii="Times New Roman" w:hAnsi="Times New Roman"/>
-                <w:b w:val="0"/>
-                <w:sz w:val="18"/>
-              </w:rPr>
-              <w:t>Report performance measures (with CIs) for the prediction model</w:t>
+              <w:t>AI-specific: Reproducibility</w:t>
             </w:r>
           </w:p>
         </w:tc>
@@ -1953,56 +1352,7 @@
           </w:tcPr>
           <w:p>
             <w:r>
-              <w:t>Results, Primary Chronological Evaluation on Observed Outcomes (Section 3.2); Tables 3–4</w:t>
-            </w:r>
-          </w:p>
-        </w:tc>
-      </w:tr>
-      <w:tr>
-        <w:tc>
-          <w:tcPr>
-            <w:tcW w:type="dxa" w:w="2160"/>
-          </w:tcPr>
-          <w:p>
-            <w:r/>
-            <w:r>
-              <w:rPr>
-                <w:rFonts w:ascii="Times New Roman" w:hAnsi="Times New Roman"/>
-                <w:b w:val="0"/>
-                <w:sz w:val="18"/>
-              </w:rPr>
-            </w:r>
-          </w:p>
-        </w:tc>
-        <w:tc>
-          <w:tcPr>
-            <w:tcW w:type="dxa" w:w="2160"/>
-          </w:tcPr>
-          <w:p>
-            <w:r/>
-            <w:r>
-              <w:rPr>
-                <w:rFonts w:ascii="Times New Roman" w:hAnsi="Times New Roman"/>
-                <w:b w:val="0"/>
-                <w:sz w:val="18"/>
-              </w:rPr>
-              <w:t>15b</w:t>
-            </w:r>
-          </w:p>
-        </w:tc>
-        <w:tc>
-          <w:tcPr>
-            <w:tcW w:type="dxa" w:w="2160"/>
-          </w:tcPr>
-          <w:p>
-            <w:r/>
-            <w:r>
-              <w:rPr>
-                <w:rFonts w:ascii="Times New Roman" w:hAnsi="Times New Roman"/>
-                <w:b w:val="0"/>
-                <w:sz w:val="18"/>
-              </w:rPr>
-              <w:t>Report results of model updating, if done</w:t>
+              <w:t>R1</w:t>
             </w:r>
           </w:p>
         </w:tc>
@@ -2012,120 +1362,7 @@
           </w:tcPr>
           <w:p>
             <w:r>
-              <w:t>N/A (no post-hoc model updating performed)</w:t>
-            </w:r>
-          </w:p>
-        </w:tc>
-      </w:tr>
-      <w:tr>
-        <w:tc>
-          <w:tcPr>
-            <w:tcW w:type="dxa" w:w="2160"/>
-          </w:tcPr>
-          <w:p>
-            <w:r/>
-            <w:r>
-              <w:rPr>
-                <w:rFonts w:ascii="Times New Roman" w:hAnsi="Times New Roman"/>
-                <w:b/>
-                <w:sz w:val="18"/>
-              </w:rPr>
-              <w:t>Discussion</w:t>
-            </w:r>
-          </w:p>
-        </w:tc>
-        <w:tc>
-          <w:tcPr>
-            <w:tcW w:type="dxa" w:w="2160"/>
-          </w:tcPr>
-          <w:p>
-            <w:r/>
-            <w:r>
-              <w:rPr>
-                <w:rFonts w:ascii="Times New Roman" w:hAnsi="Times New Roman"/>
-                <w:b w:val="0"/>
-                <w:sz w:val="18"/>
-              </w:rPr>
-            </w:r>
-          </w:p>
-        </w:tc>
-        <w:tc>
-          <w:tcPr>
-            <w:tcW w:type="dxa" w:w="2160"/>
-          </w:tcPr>
-          <w:p>
-            <w:r/>
-            <w:r>
-              <w:rPr>
-                <w:rFonts w:ascii="Times New Roman" w:hAnsi="Times New Roman"/>
-                <w:b w:val="0"/>
-                <w:sz w:val="18"/>
-              </w:rPr>
-            </w:r>
-          </w:p>
-        </w:tc>
-        <w:tc>
-          <w:tcPr>
-            <w:tcW w:type="dxa" w:w="2160"/>
-          </w:tcPr>
-          <w:p>
-            <w:r/>
-            <w:r>
-              <w:rPr>
-                <w:rFonts w:ascii="Times New Roman" w:hAnsi="Times New Roman"/>
-                <w:b w:val="0"/>
-                <w:sz w:val="18"/>
-              </w:rPr>
-            </w:r>
-          </w:p>
-        </w:tc>
-      </w:tr>
-      <w:tr>
-        <w:tc>
-          <w:tcPr>
-            <w:tcW w:type="dxa" w:w="2160"/>
-          </w:tcPr>
-          <w:p>
-            <w:r/>
-            <w:r>
-              <w:rPr>
-                <w:rFonts w:ascii="Times New Roman" w:hAnsi="Times New Roman"/>
-                <w:b w:val="0"/>
-                <w:sz w:val="18"/>
-              </w:rPr>
-              <w:t>Limitations</w:t>
-            </w:r>
-          </w:p>
-        </w:tc>
-        <w:tc>
-          <w:tcPr>
-            <w:tcW w:type="dxa" w:w="2160"/>
-          </w:tcPr>
-          <w:p>
-            <w:r/>
-            <w:r>
-              <w:rPr>
-                <w:rFonts w:ascii="Times New Roman" w:hAnsi="Times New Roman"/>
-                <w:b w:val="0"/>
-                <w:sz w:val="18"/>
-              </w:rPr>
-              <w:t>18</w:t>
-            </w:r>
-          </w:p>
-        </w:tc>
-        <w:tc>
-          <w:tcPr>
-            <w:tcW w:type="dxa" w:w="2160"/>
-          </w:tcPr>
-          <w:p>
-            <w:r/>
-            <w:r>
-              <w:rPr>
-                <w:rFonts w:ascii="Times New Roman" w:hAnsi="Times New Roman"/>
-                <w:b w:val="0"/>
-                <w:sz w:val="18"/>
-              </w:rPr>
-              <w:t>Discuss any limitations of the study</w:t>
+              <w:t>Describe software, hardware, code availability</w:t>
             </w:r>
           </w:p>
         </w:tc>
@@ -2135,310 +1372,7 @@
           </w:tcPr>
           <w:p>
             <w:r>
-              <w:t>Discussion, Strengths and Limitations (Section 4.6)</w:t>
-            </w:r>
-          </w:p>
-        </w:tc>
-      </w:tr>
-      <w:tr>
-        <w:tc>
-          <w:tcPr>
-            <w:tcW w:type="dxa" w:w="2160"/>
-          </w:tcPr>
-          <w:p>
-            <w:r/>
-            <w:r>
-              <w:rPr>
-                <w:rFonts w:ascii="Times New Roman" w:hAnsi="Times New Roman"/>
-                <w:b w:val="0"/>
-                <w:sz w:val="18"/>
-              </w:rPr>
-              <w:t>Interpretation</w:t>
-            </w:r>
-          </w:p>
-        </w:tc>
-        <w:tc>
-          <w:tcPr>
-            <w:tcW w:type="dxa" w:w="2160"/>
-          </w:tcPr>
-          <w:p>
-            <w:r/>
-            <w:r>
-              <w:rPr>
-                <w:rFonts w:ascii="Times New Roman" w:hAnsi="Times New Roman"/>
-                <w:b w:val="0"/>
-                <w:sz w:val="18"/>
-              </w:rPr>
-              <w:t>19a</w:t>
-            </w:r>
-          </w:p>
-        </w:tc>
-        <w:tc>
-          <w:tcPr>
-            <w:tcW w:type="dxa" w:w="2160"/>
-          </w:tcPr>
-          <w:p>
-            <w:r/>
-            <w:r>
-              <w:rPr>
-                <w:rFonts w:ascii="Times New Roman" w:hAnsi="Times New Roman"/>
-                <w:b w:val="0"/>
-                <w:sz w:val="18"/>
-              </w:rPr>
-              <w:t>Give an overall interpretation of the main results, considering objectives, limitations, and results from similar studies</w:t>
-            </w:r>
-          </w:p>
-        </w:tc>
-        <w:tc>
-          <w:tcPr>
-            <w:tcW w:type="dxa" w:w="2160"/>
-          </w:tcPr>
-          <w:p>
-            <w:r>
-              <w:t>Discussion (Section 4, overall)</w:t>
-            </w:r>
-          </w:p>
-        </w:tc>
-      </w:tr>
-      <w:tr>
-        <w:tc>
-          <w:tcPr>
-            <w:tcW w:type="dxa" w:w="2160"/>
-          </w:tcPr>
-          <w:p>
-            <w:r/>
-            <w:r>
-              <w:rPr>
-                <w:rFonts w:ascii="Times New Roman" w:hAnsi="Times New Roman"/>
-                <w:b w:val="0"/>
-                <w:sz w:val="18"/>
-              </w:rPr>
-              <w:t>Implications</w:t>
-            </w:r>
-          </w:p>
-        </w:tc>
-        <w:tc>
-          <w:tcPr>
-            <w:tcW w:type="dxa" w:w="2160"/>
-          </w:tcPr>
-          <w:p>
-            <w:r/>
-            <w:r>
-              <w:rPr>
-                <w:rFonts w:ascii="Times New Roman" w:hAnsi="Times New Roman"/>
-                <w:b w:val="0"/>
-                <w:sz w:val="18"/>
-              </w:rPr>
-              <w:t>20</w:t>
-            </w:r>
-          </w:p>
-        </w:tc>
-        <w:tc>
-          <w:tcPr>
-            <w:tcW w:type="dxa" w:w="2160"/>
-          </w:tcPr>
-          <w:p>
-            <w:r/>
-            <w:r>
-              <w:rPr>
-                <w:rFonts w:ascii="Times New Roman" w:hAnsi="Times New Roman"/>
-                <w:b w:val="0"/>
-                <w:sz w:val="18"/>
-              </w:rPr>
-              <w:t>Discuss the potential clinical use of the model and implications for future research</w:t>
-            </w:r>
-          </w:p>
-        </w:tc>
-        <w:tc>
-          <w:tcPr>
-            <w:tcW w:type="dxa" w:w="2160"/>
-          </w:tcPr>
-          <w:p>
-            <w:r>
-              <w:t>Discussion, Explainability as Model Auditing, and Implications for Practice (Section 4.5); Future Research (Section 4.7)</w:t>
-            </w:r>
-          </w:p>
-        </w:tc>
-      </w:tr>
-      <w:tr>
-        <w:tc>
-          <w:tcPr>
-            <w:tcW w:type="dxa" w:w="2160"/>
-          </w:tcPr>
-          <w:p>
-            <w:r/>
-            <w:r>
-              <w:rPr>
-                <w:rFonts w:ascii="Times New Roman" w:hAnsi="Times New Roman"/>
-                <w:b/>
-                <w:sz w:val="18"/>
-              </w:rPr>
-              <w:t>Other information</w:t>
-            </w:r>
-          </w:p>
-        </w:tc>
-        <w:tc>
-          <w:tcPr>
-            <w:tcW w:type="dxa" w:w="2160"/>
-          </w:tcPr>
-          <w:p>
-            <w:r/>
-            <w:r>
-              <w:rPr>
-                <w:rFonts w:ascii="Times New Roman" w:hAnsi="Times New Roman"/>
-                <w:b w:val="0"/>
-                <w:sz w:val="18"/>
-              </w:rPr>
-            </w:r>
-          </w:p>
-        </w:tc>
-        <w:tc>
-          <w:tcPr>
-            <w:tcW w:type="dxa" w:w="2160"/>
-          </w:tcPr>
-          <w:p>
-            <w:r/>
-            <w:r>
-              <w:rPr>
-                <w:rFonts w:ascii="Times New Roman" w:hAnsi="Times New Roman"/>
-                <w:b w:val="0"/>
-                <w:sz w:val="18"/>
-              </w:rPr>
-            </w:r>
-          </w:p>
-        </w:tc>
-        <w:tc>
-          <w:tcPr>
-            <w:tcW w:type="dxa" w:w="2160"/>
-          </w:tcPr>
-          <w:p>
-            <w:r/>
-            <w:r>
-              <w:rPr>
-                <w:rFonts w:ascii="Times New Roman" w:hAnsi="Times New Roman"/>
-                <w:b w:val="0"/>
-                <w:sz w:val="18"/>
-              </w:rPr>
-            </w:r>
-          </w:p>
-        </w:tc>
-      </w:tr>
-      <w:tr>
-        <w:tc>
-          <w:tcPr>
-            <w:tcW w:type="dxa" w:w="2160"/>
-          </w:tcPr>
-          <w:p>
-            <w:r/>
-            <w:r>
-              <w:rPr>
-                <w:rFonts w:ascii="Times New Roman" w:hAnsi="Times New Roman"/>
-                <w:b w:val="0"/>
-                <w:sz w:val="18"/>
-              </w:rPr>
-              <w:t>Supplementary information</w:t>
-            </w:r>
-          </w:p>
-        </w:tc>
-        <w:tc>
-          <w:tcPr>
-            <w:tcW w:type="dxa" w:w="2160"/>
-          </w:tcPr>
-          <w:p>
-            <w:r/>
-            <w:r>
-              <w:rPr>
-                <w:rFonts w:ascii="Times New Roman" w:hAnsi="Times New Roman"/>
-                <w:b w:val="0"/>
-                <w:sz w:val="18"/>
-              </w:rPr>
-              <w:t>21</w:t>
-            </w:r>
-          </w:p>
-        </w:tc>
-        <w:tc>
-          <w:tcPr>
-            <w:tcW w:type="dxa" w:w="2160"/>
-          </w:tcPr>
-          <w:p>
-            <w:r/>
-            <w:r>
-              <w:rPr>
-                <w:rFonts w:ascii="Times New Roman" w:hAnsi="Times New Roman"/>
-                <w:b w:val="0"/>
-                <w:sz w:val="18"/>
-              </w:rPr>
-              <w:t>Provide information about the availability of supplementary resources</w:t>
-            </w:r>
-          </w:p>
-        </w:tc>
-        <w:tc>
-          <w:tcPr>
-            <w:tcW w:type="dxa" w:w="2160"/>
-          </w:tcPr>
-          <w:p>
-            <w:r>
-              <w:t>Supporting Information; GitHub repository (code, cohort-construction scripts, trained model artefacts)</w:t>
-            </w:r>
-          </w:p>
-        </w:tc>
-      </w:tr>
-      <w:tr>
-        <w:tc>
-          <w:tcPr>
-            <w:tcW w:type="dxa" w:w="2160"/>
-          </w:tcPr>
-          <w:p>
-            <w:r/>
-            <w:r>
-              <w:rPr>
-                <w:rFonts w:ascii="Times New Roman" w:hAnsi="Times New Roman"/>
-                <w:b w:val="0"/>
-                <w:sz w:val="18"/>
-              </w:rPr>
-              <w:t>Funding</w:t>
-            </w:r>
-          </w:p>
-        </w:tc>
-        <w:tc>
-          <w:tcPr>
-            <w:tcW w:type="dxa" w:w="2160"/>
-          </w:tcPr>
-          <w:p>
-            <w:r/>
-            <w:r>
-              <w:rPr>
-                <w:rFonts w:ascii="Times New Roman" w:hAnsi="Times New Roman"/>
-                <w:b w:val="0"/>
-                <w:sz w:val="18"/>
-              </w:rPr>
-              <w:t>22</w:t>
-            </w:r>
-          </w:p>
-        </w:tc>
-        <w:tc>
-          <w:tcPr>
-            <w:tcW w:type="dxa" w:w="2160"/>
-          </w:tcPr>
-          <w:p>
-            <w:r/>
-            <w:r>
-              <w:rPr>
-                <w:rFonts w:ascii="Times New Roman" w:hAnsi="Times New Roman"/>
-                <w:b w:val="0"/>
-                <w:sz w:val="18"/>
-              </w:rPr>
-              <w:t>Give the source of funding and the role of the funders</w:t>
-            </w:r>
-          </w:p>
-        </w:tc>
-        <w:tc>
-          <w:tcPr>
-            <w:tcW w:type="dxa" w:w="2160"/>
-          </w:tcPr>
-          <w:p>
-            <w:r>
-              <w:t>Financial Disclosure Statement (PLOS submission system; no external funding declared)</w:t>
+              <w:t>Data availability section; Python 3.11, scikit-learn 1.5.0, XGBoost</w:t>
             </w:r>
           </w:p>
         </w:tc>

</xml_diff>